<commit_message>
feat(engines): docx-to-pdf parser — body + entry
document-xml walks the body content (paragraphs, runs,
tables, hyperlinks, drawings) and detects skip-with-warning
constructs. footnotes and headers-footers reuse the same
block walker. parseDocx is the entry; full integration test
parses all 12 DOCX fixtures into ParsedDocx snapshots.

Carry-along fixes required to make Task 5 verifiable:
- xml.ts: preserveOrder parser variant + ordered traversal
  helpers. Default mode buckets children by tag, losing the
  body's paragraph/table interleaving and run-internal text
  ordering — both load-bearing for body-content semantics.
- fixture-generator regex didn't match the <w:t xml:space=
  "preserve"> attribute the docx package emits, so OMML / RTL
  / drawing injection silently no-op'd. Regenerated equations-
  doc, drawings-doc, rtl-doc — their integration tests now
  exercise real skip-with-warning paths.
</commit_message>
<xml_diff>
--- a/tests/fixtures/drawings-doc.docx
+++ b/tests/fixtures/drawings-doc.docx
@@ -12,7 +12,17 @@
     </w:p>
     <w:p>
       <w:r>
-        <w:t xml:space="preserve">[DRAWING_PLACEHOLDER]</w:t>
+        <w:drawing>
+          <wp:inline xmlns:wp="http://schemas.openxmlformats.org/drawingml/2006/wordprocessingDrawing">
+            <wp:extent cx="914400" cy="914400"/>
+            <wp:docPr id="1" name="Shape1"/>
+            <a:graphic xmlns:a="http://schemas.openxmlformats.org/drawingml/2006/main">
+              <a:graphicData uri="http://schemas.openxmlformats.org/drawingml/2006/wordprocessingShape">
+                <wps:wsp xmlns:wps="http://schemas.microsoft.com/office/word/2010/wordprocessingShape"/>
+              </a:graphicData>
+            </a:graphic>
+          </wp:inline>
+        </w:drawing>
       </w:r>
     </w:p>
     <w:p>

</xml_diff>